<commit_message>
Update bài báo cáo
đi ngủ đã, làm liên tục 6 tiếng rồi -_-
</commit_message>
<xml_diff>
--- a/Báo cáo.docx
+++ b/Báo cáo.docx
@@ -6991,6 +6991,10 @@
     <w:p>
       <w:pPr>
         <w:spacing w:line="480" w:lineRule="atLeast"/>
+        <w:rPr>
+          <w:sz w:val="24"/>
+          <w:szCs w:val="24"/>
+        </w:rPr>
       </w:pPr>
       <w:sdt>
         <w:sdtPr>
@@ -7002,33 +7006,136 @@
         </w:sdtContent>
       </w:sdt>
       <w:r>
-        <w:t xml:space="preserve">Hình 1:  </w:t>
-      </w:r>
-      <w:commentRangeEnd w:id="5"/>
-      <w:r>
-        <w:commentReference w:id="5"/>
-      </w:r>
-      <w:r>
-        <w:t>Biểu đồ Lớp lõi</w:t>
-      </w:r>
-      <w:r>
-        <w:t xml:space="preserve"> (Core Class Diagram)</w:t>
-      </w:r>
-      <w:r>
-        <w:t>…………………………………1</w:t>
-      </w:r>
-      <w:r>
-        <w:t>2</w:t>
-      </w:r>
-    </w:p>
-    <w:p>
-      <w:pPr>
-        <w:spacing w:before="120" w:after="120" w:line="480" w:lineRule="atLeast"/>
         <w:rPr>
           <w:sz w:val="24"/>
           <w:szCs w:val="24"/>
         </w:rPr>
-      </w:pPr>
+        <w:t xml:space="preserve">Hình 1: </w:t>
+      </w:r>
+      <w:commentRangeEnd w:id="5"/>
+      <w:r>
+        <w:rPr>
+          <w:sz w:val="24"/>
+          <w:szCs w:val="24"/>
+        </w:rPr>
+        <w:commentReference w:id="5"/>
+      </w:r>
+      <w:r>
+        <w:rPr>
+          <w:sz w:val="24"/>
+          <w:szCs w:val="24"/>
+        </w:rPr>
+        <w:t>Biểu đồ Lớp lõi</w:t>
+      </w:r>
+      <w:r>
+        <w:rPr>
+          <w:sz w:val="24"/>
+          <w:szCs w:val="24"/>
+        </w:rPr>
+        <w:t xml:space="preserve"> </w:t>
+      </w:r>
+      <w:r>
+        <w:rPr>
+          <w:sz w:val="24"/>
+          <w:szCs w:val="24"/>
+        </w:rPr>
+        <w:t>– Bản vẽ tay prototype ban đầu</w:t>
+      </w:r>
+      <w:r>
+        <w:rPr>
+          <w:sz w:val="24"/>
+          <w:szCs w:val="24"/>
+        </w:rPr>
+        <w:t>....</w:t>
+      </w:r>
+      <w:r>
+        <w:rPr>
+          <w:sz w:val="24"/>
+          <w:szCs w:val="24"/>
+        </w:rPr>
+        <w:t>.</w:t>
+      </w:r>
+      <w:r>
+        <w:rPr>
+          <w:sz w:val="24"/>
+          <w:szCs w:val="24"/>
+        </w:rPr>
+        <w:t>..................................</w:t>
+      </w:r>
+      <w:r>
+        <w:rPr>
+          <w:sz w:val="24"/>
+          <w:szCs w:val="24"/>
+        </w:rPr>
+        <w:t>..........</w:t>
+      </w:r>
+      <w:r>
+        <w:rPr>
+          <w:sz w:val="24"/>
+          <w:szCs w:val="24"/>
+        </w:rPr>
+        <w:t>.</w:t>
+      </w:r>
+      <w:r>
+        <w:rPr>
+          <w:sz w:val="24"/>
+          <w:szCs w:val="24"/>
+        </w:rPr>
+        <w:t>1</w:t>
+      </w:r>
+      <w:r>
+        <w:rPr>
+          <w:sz w:val="24"/>
+          <w:szCs w:val="24"/>
+        </w:rPr>
+        <w:t>3</w:t>
+      </w:r>
+    </w:p>
+    <w:p>
+      <w:pPr>
+        <w:spacing w:before="120" w:after="120" w:line="480" w:lineRule="atLeast"/>
+        <w:rPr>
+          <w:sz w:val="24"/>
+          <w:szCs w:val="24"/>
+        </w:rPr>
+      </w:pPr>
+      <w:r>
+        <w:rPr>
+          <w:sz w:val="24"/>
+          <w:szCs w:val="24"/>
+        </w:rPr>
+        <w:t xml:space="preserve">Hình 2: Biểu đồ </w:t>
+      </w:r>
+      <w:r>
+        <w:rPr>
+          <w:sz w:val="24"/>
+          <w:szCs w:val="24"/>
+        </w:rPr>
+        <w:t>Lớp lõi – Bản vẽ UML Diagram hoàn chỉnh........................................</w:t>
+      </w:r>
+      <w:r>
+        <w:rPr>
+          <w:sz w:val="24"/>
+          <w:szCs w:val="24"/>
+        </w:rPr>
+        <w:t>..14</w:t>
+      </w:r>
+    </w:p>
+    <w:p>
+      <w:pPr>
+        <w:spacing w:before="120" w:after="120" w:line="480" w:lineRule="atLeast"/>
+        <w:rPr>
+          <w:sz w:val="24"/>
+          <w:szCs w:val="24"/>
+        </w:rPr>
+      </w:pPr>
+      <w:r>
+        <w:rPr>
+          <w:sz w:val="24"/>
+          <w:szCs w:val="24"/>
+        </w:rPr>
+        <w:t>Hình 3: Biểu đồ UML Use Case......................................................................................23</w:t>
+      </w:r>
     </w:p>
     <w:p>
       <w:pPr>
@@ -7534,6 +7641,9 @@
               <w:spacing w:before="120" w:after="120" w:line="480" w:lineRule="atLeast"/>
               <w:jc w:val="center"/>
             </w:pPr>
+            <w:r>
+              <w:t>CRUD</w:t>
+            </w:r>
           </w:p>
         </w:tc>
         <w:tc>
@@ -7545,6 +7655,17 @@
             <w:pPr>
               <w:spacing w:before="120" w:after="120" w:line="480" w:lineRule="atLeast"/>
             </w:pPr>
+            <w:r>
+              <w:t xml:space="preserve">Create – Read – Update – Delete </w:t>
+            </w:r>
+          </w:p>
+          <w:p>
+            <w:pPr>
+              <w:spacing w:before="120" w:after="120" w:line="480" w:lineRule="atLeast"/>
+            </w:pPr>
+            <w:r>
+              <w:t xml:space="preserve">Tạo – Đọc – Cập nhật – Xóa </w:t>
+            </w:r>
           </w:p>
         </w:tc>
       </w:tr>
@@ -7559,6 +7680,9 @@
               <w:spacing w:before="120" w:after="120" w:line="480" w:lineRule="atLeast"/>
               <w:jc w:val="center"/>
             </w:pPr>
+            <w:r>
+              <w:t>UML</w:t>
+            </w:r>
           </w:p>
         </w:tc>
         <w:tc>
@@ -7570,6 +7694,33 @@
             <w:pPr>
               <w:spacing w:before="120" w:after="120" w:line="480" w:lineRule="atLeast"/>
             </w:pPr>
+            <w:r>
+              <w:rPr>
+                <w:b/>
+              </w:rPr>
+              <w:t>U</w:t>
+            </w:r>
+            <w:r>
+              <w:t>nified </w:t>
+            </w:r>
+            <w:r>
+              <w:rPr>
+                <w:b/>
+              </w:rPr>
+              <w:t>M</w:t>
+            </w:r>
+            <w:r>
+              <w:t>odeling </w:t>
+            </w:r>
+            <w:r>
+              <w:rPr>
+                <w:b/>
+              </w:rPr>
+              <w:t>L</w:t>
+            </w:r>
+            <w:r>
+              <w:t>anguage</w:t>
+            </w:r>
           </w:p>
         </w:tc>
       </w:tr>
@@ -9853,6 +10004,19 @@
       </w:r>
       <w:r>
         <w:t>.</w:t>
+      </w:r>
+    </w:p>
+    <w:p>
+      <w:pPr>
+        <w:spacing w:line="480" w:lineRule="atLeast"/>
+      </w:pPr>
+    </w:p>
+    <w:p>
+      <w:pPr>
+        <w:spacing w:line="480" w:lineRule="atLeast"/>
+      </w:pPr>
+      <w:r>
+        <w:t>Biểu đồ vẽ tay ban đầu:</w:t>
       </w:r>
     </w:p>
     <w:p>
@@ -9915,6 +10079,107 @@
     </w:p>
     <w:p>
       <w:pPr>
+        <w:spacing w:line="480" w:lineRule="atLeast"/>
+      </w:pPr>
+    </w:p>
+    <w:p>
+      <w:pPr>
+        <w:spacing w:line="480" w:lineRule="atLeast"/>
+      </w:pPr>
+    </w:p>
+    <w:p>
+      <w:pPr>
+        <w:spacing w:line="480" w:lineRule="atLeast"/>
+      </w:pPr>
+    </w:p>
+    <w:p>
+      <w:pPr>
+        <w:spacing w:line="480" w:lineRule="atLeast"/>
+      </w:pPr>
+    </w:p>
+    <w:p>
+      <w:pPr>
+        <w:spacing w:line="480" w:lineRule="atLeast"/>
+      </w:pPr>
+    </w:p>
+    <w:p>
+      <w:pPr>
+        <w:spacing w:line="480" w:lineRule="atLeast"/>
+      </w:pPr>
+      <w:r>
+        <w:lastRenderedPageBreak/>
+        <w:t>Biểu đồ UML</w:t>
+      </w:r>
+      <w:r>
+        <w:t xml:space="preserve"> hoàn chỉnh</w:t>
+      </w:r>
+      <w:r>
+        <w:t xml:space="preserve"> sau khi phát triển phần mềm</w:t>
+      </w:r>
+      <w:r>
+        <w:t>:</w:t>
+      </w:r>
+    </w:p>
+    <w:p>
+      <w:pPr>
+        <w:spacing w:line="480" w:lineRule="atLeast"/>
+      </w:pPr>
+      <w:r>
+        <w:rPr>
+          <w:noProof/>
+        </w:rPr>
+        <w:drawing>
+          <wp:inline distT="0" distB="0" distL="0" distR="0" wp14:anchorId="7E69FC75" wp14:editId="146F41EA">
+            <wp:extent cx="6012180" cy="8823960"/>
+            <wp:effectExtent l="0" t="0" r="7620" b="0"/>
+            <wp:docPr id="3" name="Picture 3"/>
+            <wp:cNvGraphicFramePr>
+              <a:graphicFrameLocks xmlns:a="http://schemas.openxmlformats.org/drawingml/2006/main" noChangeAspect="1"/>
+            </wp:cNvGraphicFramePr>
+            <a:graphic xmlns:a="http://schemas.openxmlformats.org/drawingml/2006/main">
+              <a:graphicData uri="http://schemas.openxmlformats.org/drawingml/2006/picture">
+                <pic:pic xmlns:pic="http://schemas.openxmlformats.org/drawingml/2006/picture">
+                  <pic:nvPicPr>
+                    <pic:cNvPr id="0" name="Picture 3"/>
+                    <pic:cNvPicPr>
+                      <a:picLocks noChangeAspect="1" noChangeArrowheads="1"/>
+                    </pic:cNvPicPr>
+                  </pic:nvPicPr>
+                  <pic:blipFill>
+                    <a:blip r:embed="rId11" cstate="print">
+                      <a:extLst>
+                        <a:ext uri="{28A0092B-C50C-407E-A947-70E740481C1C}">
+                          <a14:useLocalDpi xmlns:a14="http://schemas.microsoft.com/office/drawing/2010/main" val="0"/>
+                        </a:ext>
+                      </a:extLst>
+                    </a:blip>
+                    <a:srcRect/>
+                    <a:stretch>
+                      <a:fillRect/>
+                    </a:stretch>
+                  </pic:blipFill>
+                  <pic:spPr bwMode="auto">
+                    <a:xfrm>
+                      <a:off x="0" y="0"/>
+                      <a:ext cx="6012180" cy="8823960"/>
+                    </a:xfrm>
+                    <a:prstGeom prst="rect">
+                      <a:avLst/>
+                    </a:prstGeom>
+                    <a:noFill/>
+                    <a:ln>
+                      <a:noFill/>
+                    </a:ln>
+                  </pic:spPr>
+                </pic:pic>
+              </a:graphicData>
+            </a:graphic>
+          </wp:inline>
+        </w:drawing>
+      </w:r>
+    </w:p>
+    <w:p>
+      <w:pPr>
         <w:pStyle w:val="Heading2"/>
         <w:numPr>
           <w:ilvl w:val="1"/>
@@ -9930,6 +10195,7 @@
         <w:rPr>
           <w:rFonts w:ascii="Times New Roman" w:hAnsi="Times New Roman" w:cs="Times New Roman"/>
         </w:rPr>
+        <w:lastRenderedPageBreak/>
         <w:t>Thiết kế chi tiết lớp</w:t>
       </w:r>
       <w:r>
@@ -10327,7 +10593,6 @@
           <w:szCs w:val="28"/>
           <w:lang w:val="en-US"/>
         </w:rPr>
-        <w:lastRenderedPageBreak/>
         <w:t xml:space="preserve">        </w:t>
       </w:r>
       <w:r>
@@ -12682,6 +12947,7 @@
           <w:szCs w:val="28"/>
           <w:lang w:val="en-US"/>
         </w:rPr>
+        <w:lastRenderedPageBreak/>
         <w:t xml:space="preserve">        </w:t>
       </w:r>
       <w:r>
@@ -13609,7 +13875,6 @@
           <w:szCs w:val="28"/>
           <w:lang w:val="en-US"/>
         </w:rPr>
-        <w:lastRenderedPageBreak/>
         <w:t xml:space="preserve">        </w:t>
       </w:r>
       <w:r>
@@ -13885,31 +14150,7 @@
           <w:szCs w:val="28"/>
           <w:lang w:val="en-US"/>
         </w:rPr>
-        <w:t xml:space="preserve"> </w:t>
-      </w:r>
-      <w:proofErr w:type="spellStart"/>
-      <w:r>
-        <w:rPr>
-          <w:rFonts w:ascii="Courier New" w:hAnsi="Courier New" w:cs="Courier New"/>
-          <w:bCs w:val="0"/>
-          <w:color w:val="696969"/>
-          <w:sz w:val="28"/>
-          <w:szCs w:val="28"/>
-          <w:lang w:val="en-US"/>
-        </w:rPr>
-        <w:t>ký</w:t>
-      </w:r>
-      <w:proofErr w:type="spellEnd"/>
-      <w:r>
-        <w:rPr>
-          <w:rFonts w:ascii="Courier New" w:hAnsi="Courier New" w:cs="Courier New"/>
-          <w:bCs w:val="0"/>
-          <w:color w:val="696969"/>
-          <w:sz w:val="28"/>
-          <w:szCs w:val="28"/>
-          <w:lang w:val="en-US"/>
-        </w:rPr>
-        <w:t xml:space="preserve"> </w:t>
+        <w:t xml:space="preserve"> ký </w:t>
       </w:r>
       <w:proofErr w:type="spellStart"/>
       <w:r>
@@ -15043,21 +15284,8 @@
           <w:szCs w:val="28"/>
           <w:lang w:val="en-US"/>
         </w:rPr>
-        <w:t xml:space="preserve"> </w:t>
-      </w:r>
-      <w:proofErr w:type="spellStart"/>
-      <w:r>
-        <w:rPr>
-          <w:rFonts w:ascii="Courier New" w:hAnsi="Courier New" w:cs="Courier New"/>
-          <w:bCs w:val="0"/>
-          <w:color w:val="696969"/>
-          <w:sz w:val="28"/>
-          <w:szCs w:val="28"/>
-          <w:lang w:val="en-US"/>
-        </w:rPr>
-        <w:t>hình</w:t>
-      </w:r>
-      <w:proofErr w:type="spellEnd"/>
+        <w:t xml:space="preserve"> hình</w:t>
+      </w:r>
     </w:p>
     <w:p>
       <w:pPr>
@@ -15425,21 +15653,8 @@
           <w:szCs w:val="28"/>
           <w:lang w:val="en-US"/>
         </w:rPr>
-        <w:t xml:space="preserve"> </w:t>
-      </w:r>
-      <w:proofErr w:type="spellStart"/>
-      <w:r>
-        <w:rPr>
-          <w:rFonts w:ascii="Courier New" w:hAnsi="Courier New" w:cs="Courier New"/>
-          <w:bCs w:val="0"/>
-          <w:color w:val="696969"/>
-          <w:sz w:val="28"/>
-          <w:szCs w:val="28"/>
-          <w:lang w:val="en-US"/>
-        </w:rPr>
-        <w:t>tiền</w:t>
-      </w:r>
-      <w:proofErr w:type="spellEnd"/>
+        <w:t xml:space="preserve"> tiền</w:t>
+      </w:r>
     </w:p>
     <w:p>
       <w:pPr>
@@ -16796,7 +17011,6 @@
         <w:rPr>
           <w:b/>
         </w:rPr>
-        <w:lastRenderedPageBreak/>
         <w:t xml:space="preserve">- </w:t>
       </w:r>
       <w:r>
@@ -17931,6 +18145,7 @@
           <w:bCs w:val="0"/>
           <w:lang w:val="en-US"/>
         </w:rPr>
+        <w:lastRenderedPageBreak/>
         <w:t xml:space="preserve">static string </w:t>
       </w:r>
       <w:proofErr w:type="spellStart"/>
@@ -18618,7 +18833,6 @@
         <w:rPr>
           <w:rFonts w:ascii="Times New Roman" w:hAnsi="Times New Roman" w:cs="Times New Roman"/>
         </w:rPr>
-        <w:lastRenderedPageBreak/>
         <w:t>Lớp Dẫn xuất ( DoDienTu ) và ( DoGiaDung )</w:t>
       </w:r>
       <w:bookmarkEnd w:id="41"/>
@@ -21123,7 +21337,6 @@
         <w:rPr>
           <w:rFonts w:ascii="Times New Roman" w:hAnsi="Times New Roman" w:cs="Times New Roman"/>
         </w:rPr>
-        <w:lastRenderedPageBreak/>
         <w:t>Lớp ( HoaDon )</w:t>
       </w:r>
       <w:r>
@@ -22894,6 +23107,7 @@
           <w:szCs w:val="28"/>
           <w:lang w:val="en-US"/>
         </w:rPr>
+        <w:lastRenderedPageBreak/>
         <w:t xml:space="preserve">    </w:t>
       </w:r>
       <w:r>
@@ -23273,7 +23487,6 @@
           <w:szCs w:val="28"/>
           <w:lang w:val="en-US"/>
         </w:rPr>
-        <w:lastRenderedPageBreak/>
         <w:t xml:space="preserve">        </w:t>
       </w:r>
       <w:r>
@@ -25541,6 +25754,7 @@
           <w:b/>
           <w:bCs w:val="0"/>
         </w:rPr>
+        <w:lastRenderedPageBreak/>
         <w:t>themSanPham()</w:t>
       </w:r>
       <w:r>
@@ -25647,7 +25861,6 @@
           <w:b/>
           <w:bCs w:val="0"/>
         </w:rPr>
-        <w:lastRenderedPageBreak/>
         <w:t>inHoaDon():</w:t>
       </w:r>
       <w:r>
@@ -25699,19 +25912,28 @@
           <w:rFonts w:ascii="Times New Roman" w:hAnsi="Times New Roman" w:cs="Times New Roman"/>
         </w:rPr>
       </w:pPr>
-      <w:bookmarkStart w:id="45" w:name="_Toc231659698"/>
       <w:r>
         <w:rPr>
           <w:rFonts w:ascii="Times New Roman" w:hAnsi="Times New Roman" w:cs="Times New Roman"/>
         </w:rPr>
-        <w:t>Nội dung</w:t>
-      </w:r>
-      <w:bookmarkEnd w:id="45"/>
+        <w:t>Thiết kế chi tiết Hệ thống Điều hướng Giao diện Menu</w:t>
+      </w:r>
       <w:r>
         <w:rPr>
           <w:rFonts w:ascii="Times New Roman" w:hAnsi="Times New Roman" w:cs="Times New Roman"/>
         </w:rPr>
-        <w:t xml:space="preserve"> </w:t>
+        <w:t xml:space="preserve"> Console</w:t>
+      </w:r>
+      <w:r>
+        <w:rPr>
+          <w:rFonts w:ascii="Times New Roman" w:hAnsi="Times New Roman" w:cs="Times New Roman"/>
+        </w:rPr>
+        <w:t xml:space="preserve"> (Menu.h) </w:t>
+      </w:r>
+    </w:p>
+    <w:p>
+      <w:r>
+        <w:t>File này đóng vai trò như bộ điều khiển trung tâm (Controller), kết nối tầng giao diện người dùng với tầng dữ liệu file.</w:t>
       </w:r>
     </w:p>
     <w:p>
@@ -25724,16 +25946,144 @@
         <w:spacing w:line="480" w:lineRule="atLeast"/>
         <w:rPr>
           <w:rFonts w:ascii="Times New Roman" w:hAnsi="Times New Roman" w:cs="Times New Roman"/>
-        </w:rPr>
-      </w:pPr>
-      <w:bookmarkStart w:id="46" w:name="_Toc231659699"/>
+          <w:bCs/>
+        </w:rPr>
+      </w:pPr>
       <w:r>
         <w:rPr>
           <w:rFonts w:ascii="Times New Roman" w:hAnsi="Times New Roman" w:cs="Times New Roman"/>
-        </w:rPr>
-        <w:t>Nội dung nhỏ</w:t>
-      </w:r>
-      <w:bookmarkEnd w:id="46"/>
+          <w:bCs/>
+        </w:rPr>
+        <w:t>Quản lý Bộ Nhớ &amp; Chuyển đổi</w:t>
+      </w:r>
+      <w:r>
+        <w:rPr>
+          <w:rFonts w:ascii="Times New Roman" w:hAnsi="Times New Roman" w:cs="Times New Roman"/>
+          <w:bCs/>
+        </w:rPr>
+        <w:t xml:space="preserve"> dữ liệu</w:t>
+      </w:r>
+      <w:r>
+        <w:rPr>
+          <w:rFonts w:ascii="Times New Roman" w:hAnsi="Times New Roman" w:cs="Times New Roman"/>
+          <w:bCs/>
+        </w:rPr>
+        <w:t xml:space="preserve"> File sang Đối tượng Object</w:t>
+      </w:r>
+    </w:p>
+    <w:p>
+      <w:pPr>
+        <w:pStyle w:val="ListParagraph"/>
+        <w:numPr>
+          <w:ilvl w:val="0"/>
+          <w:numId w:val="7"/>
+        </w:numPr>
+      </w:pPr>
+      <w:r>
+        <w:rPr>
+          <w:b/>
+        </w:rPr>
+        <w:t>giaiPhongDanhSachSanPham(vector&lt;SanPham*&gt;&amp; danhSach):</w:t>
+      </w:r>
+      <w:r>
+        <w:t xml:space="preserve"> Duyệt qua vector con trỏ, thực hiện delete từng vùng nhớ đối tượng sản phẩm được cấp phát động, sau đó .clear() danh sách để tránh lọt con trỏ rác.</w:t>
+      </w:r>
+    </w:p>
+    <w:p>
+      <w:pPr>
+        <w:pStyle w:val="ListParagraph"/>
+        <w:numPr>
+          <w:ilvl w:val="0"/>
+          <w:numId w:val="7"/>
+        </w:numPr>
+      </w:pPr>
+      <w:r>
+        <w:rPr>
+          <w:b/>
+        </w:rPr>
+        <w:t>taoSanPhamTuDong(...):</w:t>
+      </w:r>
+      <w:r>
+        <w:t xml:space="preserve"> Đóng vai trò như một </w:t>
+      </w:r>
+      <w:r>
+        <w:rPr>
+          <w:i/>
+          <w:iCs/>
+        </w:rPr>
+        <w:t>Factory Method đơn giản</w:t>
+      </w:r>
+      <w:r>
+        <w:t xml:space="preserve">. Dựa vào chuỗi định danh "DDT" hay "DGD" đọc từ file, hàm sẽ dùng từ khóa new để khởi tạo chính xác vùng nhớ cho DoDienTu hoặc DoGiaDung. Đồng thời cập nhật lại bộ đếm tĩnh </w:t>
+      </w:r>
+      <w:r>
+        <w:rPr>
+          <w:b/>
+          <w:bCs w:val="0"/>
+        </w:rPr>
+        <w:t>SanPham::DemMatHang</w:t>
+      </w:r>
+      <w:r>
+        <w:t xml:space="preserve"> để đảm bảo khi người dùng tạo sản phẩm mới tiếp theo, số thứ tự ID không bị trùng lặp với dữ liệu cũ trong file.</w:t>
+      </w:r>
+    </w:p>
+    <w:p>
+      <w:pPr>
+        <w:pStyle w:val="ListParagraph"/>
+        <w:numPr>
+          <w:ilvl w:val="0"/>
+          <w:numId w:val="7"/>
+        </w:numPr>
+      </w:pPr>
+      <w:r>
+        <w:rPr>
+          <w:b/>
+        </w:rPr>
+        <w:t>docTatCaSanPham(const string&amp; tenFile):</w:t>
+      </w:r>
+      <w:r>
+        <w:t xml:space="preserve"> Mở file dữ liệu, đọc từng dòng văn bản, tách các thuộc tính qua phân cách</w:t>
+      </w:r>
+      <w:r>
+        <w:t xml:space="preserve"> </w:t>
+      </w:r>
+      <w:r>
+        <w:rPr>
+          <w:b/>
+          <w:bCs w:val="0"/>
+        </w:rPr>
+        <w:t>(</w:t>
+      </w:r>
+      <w:r>
+        <w:rPr>
+          <w:b/>
+          <w:bCs w:val="0"/>
+        </w:rPr>
+        <w:t xml:space="preserve"> | </w:t>
+      </w:r>
+      <w:r>
+        <w:rPr>
+          <w:b/>
+          <w:bCs w:val="0"/>
+        </w:rPr>
+        <w:t>)</w:t>
+      </w:r>
+      <w:r>
+        <w:t xml:space="preserve"> </w:t>
+      </w:r>
+      <w:r>
+        <w:t xml:space="preserve">bằng stringstream, chuyển đổi kiểu dữ liệu tương ứng rồi gọi taoSanPhamTuDong để nạp toàn bộ danh sách sản phẩm vào một </w:t>
+      </w:r>
+      <w:r>
+        <w:rPr>
+          <w:b/>
+          <w:bCs w:val="0"/>
+        </w:rPr>
+        <w:t>vector&lt;SanPham*&gt;</w:t>
+      </w:r>
+      <w:r>
+        <w:t xml:space="preserve"> trên RAM.</w:t>
+      </w:r>
     </w:p>
     <w:p>
       <w:pPr>
@@ -25745,27 +26095,869 @@
         <w:spacing w:line="480" w:lineRule="atLeast"/>
         <w:rPr>
           <w:rFonts w:ascii="Times New Roman" w:hAnsi="Times New Roman" w:cs="Times New Roman"/>
-        </w:rPr>
-      </w:pPr>
-      <w:bookmarkStart w:id="47" w:name="_Toc231659700"/>
+          <w:bCs/>
+        </w:rPr>
+      </w:pPr>
       <w:r>
         <w:rPr>
           <w:rFonts w:ascii="Times New Roman" w:hAnsi="Times New Roman" w:cs="Times New Roman"/>
-        </w:rPr>
-        <w:t>Nội dung nhỏ</w:t>
-      </w:r>
-      <w:bookmarkEnd w:id="47"/>
-    </w:p>
-    <w:p>
-      <w:pPr>
-        <w:spacing w:before="0" w:after="0" w:line="480" w:lineRule="atLeast"/>
+          <w:bCs/>
+        </w:rPr>
+        <w:t>Các chức năng nghiệp vụ quản lý</w:t>
+      </w:r>
+      <w:r>
+        <w:rPr>
+          <w:rFonts w:ascii="Times New Roman" w:hAnsi="Times New Roman" w:cs="Times New Roman"/>
+          <w:bCs/>
+        </w:rPr>
+        <w:t xml:space="preserve"> dữ liệu cơ bản</w:t>
+      </w:r>
+      <w:r>
+        <w:rPr>
+          <w:rFonts w:ascii="Times New Roman" w:hAnsi="Times New Roman" w:cs="Times New Roman"/>
+          <w:bCs/>
+        </w:rPr>
+        <w:t xml:space="preserve"> (CRUD)</w:t>
+      </w:r>
+    </w:p>
+    <w:p>
+      <w:pPr>
+        <w:pStyle w:val="ListParagraph"/>
+        <w:numPr>
+          <w:ilvl w:val="0"/>
+          <w:numId w:val="7"/>
+        </w:numPr>
+      </w:pPr>
+      <w:r>
+        <w:rPr>
+          <w:b/>
+        </w:rPr>
+        <w:t>timSanPhamTheoMa(...):</w:t>
+      </w:r>
+      <w:r>
+        <w:t xml:space="preserve"> Duyệt vòng lặp trong vector để tìm kiếm sản phẩm có mã trùng khớp.</w:t>
+      </w:r>
+    </w:p>
+    <w:p>
+      <w:pPr>
+        <w:pStyle w:val="ListParagraph"/>
+        <w:numPr>
+          <w:ilvl w:val="0"/>
+          <w:numId w:val="7"/>
+        </w:numPr>
+      </w:pPr>
+      <w:r>
+        <w:rPr>
+          <w:b/>
+        </w:rPr>
+        <w:lastRenderedPageBreak/>
+        <w:t>inSanPhamTheoMa(...):</w:t>
+      </w:r>
+      <w:r>
+        <w:t xml:space="preserve"> Đọc dữ liệu từ file lên RAM, tìm sản phẩm và gọi hàm Xuat() của nó, sau đó giải phóng bộ nhớ ngay lập tức.</w:t>
+      </w:r>
+    </w:p>
+    <w:p>
+      <w:pPr>
+        <w:pStyle w:val="ListParagraph"/>
+        <w:numPr>
+          <w:ilvl w:val="0"/>
+          <w:numId w:val="7"/>
+        </w:numPr>
+      </w:pPr>
+      <w:r>
+        <w:rPr>
+          <w:b/>
+        </w:rPr>
+        <w:t>luuDanhSachSanPham(...):</w:t>
+      </w:r>
+      <w:r>
+        <w:t xml:space="preserve"> Ghi đè lại toàn bộ nội dung file (ios::trunc) bằng dữ liệu mới nhất từ vector trên RAM. Thường dùng sau khi Xóa hoặc Sửa đổi thông tin.</w:t>
+      </w:r>
+    </w:p>
+    <w:p>
+      <w:pPr>
+        <w:pStyle w:val="ListParagraph"/>
+        <w:numPr>
+          <w:ilvl w:val="0"/>
+          <w:numId w:val="7"/>
+        </w:numPr>
+      </w:pPr>
+      <w:r>
+        <w:rPr>
+          <w:b/>
+        </w:rPr>
+        <w:t>inTatCaSanPhamTuFile(...):</w:t>
+      </w:r>
+      <w:r>
+        <w:t xml:space="preserve"> Đọc file, duyệt danh sách và in toàn bộ sản phẩm hiện có ra màn hình.</w:t>
+      </w:r>
+    </w:p>
+    <w:p>
+      <w:pPr>
+        <w:pStyle w:val="ListParagraph"/>
+        <w:numPr>
+          <w:ilvl w:val="0"/>
+          <w:numId w:val="7"/>
+        </w:numPr>
+      </w:pPr>
+      <w:r>
+        <w:rPr>
+          <w:b/>
+        </w:rPr>
+        <w:t>xoaSanPham(...):</w:t>
+      </w:r>
+      <w:r>
+        <w:t xml:space="preserve"> Tìm sản phẩm theo mã trong danh sách RAM, tiến hành xóa phần tử, giải phóng vùng nhớ của nó rồi lưu đè lại file.</w:t>
+      </w:r>
+    </w:p>
+    <w:p>
+      <w:pPr>
+        <w:pStyle w:val="ListParagraph"/>
+        <w:numPr>
+          <w:ilvl w:val="0"/>
+          <w:numId w:val="7"/>
+        </w:numPr>
+      </w:pPr>
+      <w:r>
+        <w:rPr>
+          <w:b/>
+        </w:rPr>
+        <w:t>suaSanPham(...):</w:t>
+      </w:r>
+      <w:r>
+        <w:t xml:space="preserve"> Tìm sản phẩm, hiển thị thông tin cũ, cho phép người dùng nhấn Enter để bỏ qua hoặc gõ giá trị mới (Tên, NSX, Giá, Kho) để cập nhật, sau đó cập nhật lại file.</w:t>
+      </w:r>
+    </w:p>
+    <w:p>
+      <w:pPr>
+        <w:pStyle w:val="Heading3"/>
+        <w:numPr>
+          <w:ilvl w:val="2"/>
+          <w:numId w:val="1"/>
+        </w:numPr>
+        <w:rPr>
+          <w:rFonts w:ascii="Times New Roman" w:hAnsi="Times New Roman" w:cs="Times New Roman"/>
+        </w:rPr>
+      </w:pPr>
+      <w:bookmarkStart w:id="45" w:name="_Toc231659701"/>
+      <w:r>
+        <w:rPr>
+          <w:rFonts w:ascii="Times New Roman" w:hAnsi="Times New Roman" w:cs="Times New Roman"/>
+        </w:rPr>
+        <w:t xml:space="preserve">Luồng Nghiệp Vụ Bán Hàng &amp; </w:t>
+      </w:r>
+      <w:r>
+        <w:rPr>
+          <w:rFonts w:ascii="Times New Roman" w:hAnsi="Times New Roman" w:cs="Times New Roman"/>
+        </w:rPr>
+        <w:t>Hóa Đơn</w:t>
+      </w:r>
+    </w:p>
+    <w:p>
+      <w:pPr>
+        <w:pStyle w:val="ListParagraph"/>
+        <w:numPr>
+          <w:ilvl w:val="0"/>
+          <w:numId w:val="7"/>
+        </w:numPr>
+      </w:pPr>
+      <w:r>
+        <w:rPr>
+          <w:b/>
+        </w:rPr>
+        <w:t>lapHoaDonBanHang(...):</w:t>
+      </w:r>
+      <w:r>
+        <w:t xml:space="preserve"> Đây là hàm phức hợp quan trọng nhất:</w:t>
+      </w:r>
+    </w:p>
+    <w:p>
+      <w:pPr>
+        <w:pStyle w:val="ListParagraph"/>
+        <w:numPr>
+          <w:ilvl w:val="0"/>
+          <w:numId w:val="4"/>
+        </w:numPr>
+      </w:pPr>
+      <w:r>
+        <w:t>Tải danh sách sản phẩm từ file lên bộ nhớ tạm</w:t>
+      </w:r>
+      <w:r>
+        <w:t xml:space="preserve"> (RAM)</w:t>
+      </w:r>
+      <w:r>
+        <w:t>.</w:t>
+      </w:r>
+    </w:p>
+    <w:p>
+      <w:pPr>
+        <w:pStyle w:val="ListParagraph"/>
+        <w:numPr>
+          <w:ilvl w:val="0"/>
+          <w:numId w:val="4"/>
+        </w:numPr>
+      </w:pPr>
+      <w:r>
+        <w:t>Khởi tạo một đối tượng HoaDon.</w:t>
+      </w:r>
+    </w:p>
+    <w:p>
+      <w:pPr>
+        <w:pStyle w:val="ListParagraph"/>
+        <w:numPr>
+          <w:ilvl w:val="0"/>
+          <w:numId w:val="4"/>
+        </w:numPr>
+      </w:pPr>
+      <w:r>
+        <w:t>Mở vòng lặp cho phép thu ngân nhập liên tiếp các mã sản phẩm và số lượng cần mua.</w:t>
+      </w:r>
+    </w:p>
+    <w:p>
+      <w:pPr>
+        <w:pStyle w:val="ListParagraph"/>
+        <w:numPr>
+          <w:ilvl w:val="0"/>
+          <w:numId w:val="4"/>
+        </w:numPr>
+      </w:pPr>
+      <w:r>
+        <w:t>Cập nhật trực tiếp số lượng tồn kho trên RAM thông qua đối tượng hóa đơn.</w:t>
+      </w:r>
+    </w:p>
+    <w:p>
+      <w:pPr>
+        <w:pStyle w:val="ListParagraph"/>
+        <w:numPr>
+          <w:ilvl w:val="0"/>
+          <w:numId w:val="4"/>
+        </w:numPr>
+        <w:jc w:val="left"/>
+      </w:pPr>
+      <w:r>
+        <w:t xml:space="preserve">Kết thúc mua hàng, hàm tiến hành in hóa đơn ra màn hình, ghi dữ liệu biên lai vào file </w:t>
+      </w:r>
+      <w:r>
+        <w:rPr>
+          <w:b/>
+          <w:bCs w:val="0"/>
+        </w:rPr>
+        <w:t xml:space="preserve">( </w:t>
+      </w:r>
+      <w:r>
+        <w:rPr>
+          <w:b/>
+          <w:bCs w:val="0"/>
+        </w:rPr>
+        <w:t>hoadon.txt</w:t>
+      </w:r>
+      <w:r>
+        <w:rPr>
+          <w:b/>
+          <w:bCs w:val="0"/>
+        </w:rPr>
+        <w:t xml:space="preserve"> )</w:t>
+      </w:r>
+      <w:r>
+        <w:t xml:space="preserve"> và đồng thời </w:t>
+      </w:r>
+      <w:r>
+        <w:t>cập nhật</w:t>
+      </w:r>
+      <w:r>
+        <w:t xml:space="preserve"> số lượng tồn kho mới vào file </w:t>
+      </w:r>
+      <w:r>
+        <w:rPr>
+          <w:b/>
+          <w:bCs w:val="0"/>
+        </w:rPr>
+        <w:t xml:space="preserve">( </w:t>
+      </w:r>
+      <w:r>
+        <w:rPr>
+          <w:b/>
+          <w:bCs w:val="0"/>
+        </w:rPr>
+        <w:t>sanpham.txt</w:t>
+      </w:r>
+      <w:r>
+        <w:rPr>
+          <w:b/>
+          <w:bCs w:val="0"/>
+        </w:rPr>
+        <w:t xml:space="preserve"> )</w:t>
+      </w:r>
+      <w:r>
+        <w:t>.</w:t>
+      </w:r>
+    </w:p>
+    <w:p>
+      <w:pPr>
+        <w:pStyle w:val="ListParagraph"/>
+        <w:numPr>
+          <w:ilvl w:val="0"/>
+          <w:numId w:val="7"/>
+        </w:numPr>
+        <w:jc w:val="left"/>
+      </w:pPr>
+      <w:r>
+        <w:rPr>
+          <w:b/>
+        </w:rPr>
+        <w:t>docTatCaHoaDon(...):</w:t>
+      </w:r>
+      <w:r>
+        <w:t xml:space="preserve"> Đọc file văn bản </w:t>
+      </w:r>
+      <w:r>
+        <w:rPr>
+          <w:b/>
+          <w:bCs w:val="0"/>
+        </w:rPr>
+        <w:t xml:space="preserve">( </w:t>
+      </w:r>
+      <w:r>
+        <w:rPr>
+          <w:b/>
+          <w:bCs w:val="0"/>
+        </w:rPr>
+        <w:t>hoadon.txt</w:t>
+      </w:r>
+      <w:r>
+        <w:rPr>
+          <w:b/>
+          <w:bCs w:val="0"/>
+        </w:rPr>
+        <w:t xml:space="preserve"> )</w:t>
+      </w:r>
+      <w:r>
+        <w:t xml:space="preserve">, </w:t>
+      </w:r>
+      <w:r>
+        <w:t>nhận diện các khối văn bản nằm giữa các đường kẻ</w:t>
+      </w:r>
+      <w:r>
+        <w:t xml:space="preserve"> ( </w:t>
+      </w:r>
+      <w:r>
+        <w:t>===============================</w:t>
+      </w:r>
+      <w:r>
+        <w:t xml:space="preserve"> )</w:t>
+      </w:r>
+      <w:r>
+        <w:t xml:space="preserve"> để phân tách và đóng gói từng hóa đơn thành một chuỗi </w:t>
+      </w:r>
+      <w:r>
+        <w:rPr>
+          <w:b/>
+          <w:bCs w:val="0"/>
+        </w:rPr>
+        <w:t>string</w:t>
+      </w:r>
+      <w:r>
+        <w:t xml:space="preserve"> riêng biệt, trả về một danh sách các chuỗi hóa đơn.</w:t>
+      </w:r>
+    </w:p>
+    <w:p>
+      <w:pPr>
+        <w:pStyle w:val="ListParagraph"/>
+        <w:numPr>
+          <w:ilvl w:val="0"/>
+          <w:numId w:val="7"/>
+        </w:numPr>
+        <w:jc w:val="left"/>
+      </w:pPr>
+      <w:r>
+        <w:rPr>
+          <w:b/>
+        </w:rPr>
+        <w:t>inHoaDonMoiNhatTuFile(...):</w:t>
+      </w:r>
+      <w:r>
+        <w:t xml:space="preserve"> Lấy phần tử cuối cùng </w:t>
+      </w:r>
+      <w:r>
+        <w:rPr>
+          <w:b/>
+          <w:bCs w:val="0"/>
+        </w:rPr>
+        <w:t>(</w:t>
+      </w:r>
+      <w:r>
+        <w:rPr>
+          <w:b/>
+          <w:bCs w:val="0"/>
+        </w:rPr>
+        <w:t xml:space="preserve"> </w:t>
+      </w:r>
+      <w:r>
+        <w:rPr>
+          <w:b/>
+          <w:bCs w:val="0"/>
+        </w:rPr>
+        <w:t>.back()</w:t>
+      </w:r>
+      <w:r>
+        <w:rPr>
+          <w:b/>
+          <w:bCs w:val="0"/>
+        </w:rPr>
+        <w:t xml:space="preserve"> </w:t>
+      </w:r>
+      <w:r>
+        <w:rPr>
+          <w:b/>
+          <w:bCs w:val="0"/>
+        </w:rPr>
+        <w:t>)</w:t>
+      </w:r>
+      <w:r>
+        <w:t xml:space="preserve"> từ danh sách chuỗi hóa đơn vừa đọc để hiển thị ra màn hình.</w:t>
+      </w:r>
+    </w:p>
+    <w:p>
+      <w:pPr>
+        <w:pStyle w:val="ListParagraph"/>
+        <w:numPr>
+          <w:ilvl w:val="0"/>
+          <w:numId w:val="7"/>
+        </w:numPr>
+        <w:jc w:val="left"/>
+      </w:pPr>
+      <w:r>
+        <w:rPr>
+          <w:b/>
+        </w:rPr>
+        <w:t>xoaHoaDonCuNhat(...):</w:t>
+      </w:r>
+      <w:r>
+        <w:t xml:space="preserve"> Xóa phần tử đầu tiên </w:t>
+      </w:r>
+      <w:r>
+        <w:rPr>
+          <w:b/>
+          <w:bCs w:val="0"/>
+        </w:rPr>
+        <w:t>(</w:t>
+      </w:r>
+      <w:r>
+        <w:rPr>
+          <w:b/>
+          <w:bCs w:val="0"/>
+        </w:rPr>
+        <w:t xml:space="preserve"> </w:t>
+      </w:r>
+      <w:r>
+        <w:rPr>
+          <w:b/>
+          <w:bCs w:val="0"/>
+        </w:rPr>
+        <w:t>.begin()</w:t>
+      </w:r>
+      <w:r>
+        <w:rPr>
+          <w:b/>
+          <w:bCs w:val="0"/>
+        </w:rPr>
+        <w:t xml:space="preserve"> </w:t>
+      </w:r>
+      <w:r>
+        <w:rPr>
+          <w:b/>
+          <w:bCs w:val="0"/>
+        </w:rPr>
+        <w:t>)</w:t>
+      </w:r>
+      <w:r>
+        <w:t xml:space="preserve"> trong mảng chuỗi hóa đơn (tương ứng hóa đơn xuất hiện sớm nhất ở đầu file) rồi lưu các hóa đơn còn lại đè vào file.</w:t>
+      </w:r>
+    </w:p>
+    <w:p>
+      <w:pPr>
+        <w:pStyle w:val="Heading3"/>
+        <w:numPr>
+          <w:ilvl w:val="2"/>
+          <w:numId w:val="1"/>
+        </w:numPr>
+        <w:rPr>
+          <w:rFonts w:ascii="Times New Roman" w:hAnsi="Times New Roman" w:cs="Times New Roman"/>
+        </w:rPr>
+      </w:pPr>
+      <w:r>
+        <w:rPr>
+          <w:rFonts w:ascii="Times New Roman" w:hAnsi="Times New Roman" w:cs="Times New Roman"/>
+        </w:rPr>
+        <w:t>Hàm định dạng Giao diện Menu</w:t>
+      </w:r>
+    </w:p>
+    <w:p>
+      <w:pPr>
+        <w:pStyle w:val="ListParagraph"/>
+        <w:numPr>
+          <w:ilvl w:val="0"/>
+          <w:numId w:val="7"/>
+        </w:numPr>
+        <w:jc w:val="left"/>
+      </w:pPr>
+      <w:r>
+        <w:rPr>
+          <w:b/>
+        </w:rPr>
+        <w:t>canGiua(...), inDuongKeMenu(...), inDongCanGiuaMenu(...),</w:t>
+      </w:r>
+      <w:r>
+        <w:rPr>
+          <w:b/>
+        </w:rPr>
+        <w:t xml:space="preserve"> </w:t>
+      </w:r>
+      <w:r>
+        <w:rPr>
+          <w:b/>
+        </w:rPr>
+        <w:t>inDongMenu(...):</w:t>
+      </w:r>
+      <w:r>
+        <w:t xml:space="preserve"> Các hàm bổ trợ xử lý chuỗi và độ rộng </w:t>
+      </w:r>
+      <w:r>
+        <w:rPr>
+          <w:b/>
+          <w:bCs w:val="0"/>
+        </w:rPr>
+        <w:t>std::setw</w:t>
+      </w:r>
+      <w:r>
+        <w:t xml:space="preserve"> để căn lề giữa, vẽ các góc </w:t>
+      </w:r>
+      <w:r>
+        <w:t xml:space="preserve">( </w:t>
+      </w:r>
+      <w:r>
+        <w:rPr>
+          <w:b/>
+          <w:bCs w:val="0"/>
+        </w:rPr>
+        <w:t>+, |, -</w:t>
+      </w:r>
+      <w:r>
+        <w:rPr>
+          <w:b/>
+          <w:bCs w:val="0"/>
+        </w:rPr>
+        <w:t xml:space="preserve"> )</w:t>
+      </w:r>
+      <w:r>
+        <w:t xml:space="preserve"> giúp khung menu hiển thị đẹp, vuông vắn trên màn hình console.</w:t>
+      </w:r>
+    </w:p>
+    <w:p>
+      <w:pPr>
+        <w:pStyle w:val="ListParagraph"/>
+        <w:numPr>
+          <w:ilvl w:val="0"/>
+          <w:numId w:val="7"/>
+        </w:numPr>
+        <w:jc w:val="left"/>
+      </w:pPr>
+      <w:r>
+        <w:rPr>
+          <w:b/>
+        </w:rPr>
+        <w:lastRenderedPageBreak/>
+        <w:t>hienThiMenu():</w:t>
+      </w:r>
+      <w:r>
+        <w:t xml:space="preserve"> In toàn bộ bảng danh sách 9 lựa chọn chức năng ra màn hình.</w:t>
+      </w:r>
+    </w:p>
+    <w:p>
+      <w:pPr>
+        <w:pStyle w:val="ListParagraph"/>
+        <w:numPr>
+          <w:ilvl w:val="0"/>
+          <w:numId w:val="7"/>
+        </w:numPr>
+        <w:jc w:val="left"/>
+      </w:pPr>
+      <w:r>
+        <w:rPr>
+          <w:b/>
+        </w:rPr>
+        <w:t>xuLyLuaChon(int luaChon):</w:t>
+      </w:r>
+      <w:r>
+        <w:t xml:space="preserve"> Cấu trúc </w:t>
+      </w:r>
+      <w:r>
+        <w:rPr>
+          <w:b/>
+          <w:bCs w:val="0"/>
+        </w:rPr>
+        <w:t>switch-case</w:t>
+      </w:r>
+      <w:r>
+        <w:t xml:space="preserve"> tương ứng với lựa chọn từ 1 đến 9 để kích hoạt các hàm xử lý logic đã phân tích ở trên.</w:t>
+      </w:r>
+    </w:p>
+    <w:p>
+      <w:pPr>
+        <w:pStyle w:val="Heading2"/>
+        <w:numPr>
+          <w:ilvl w:val="1"/>
+          <w:numId w:val="1"/>
+        </w:numPr>
+        <w:rPr>
+          <w:rFonts w:ascii="Times New Roman" w:hAnsi="Times New Roman" w:cs="Times New Roman"/>
+        </w:rPr>
+      </w:pPr>
+      <w:r>
+        <w:rPr>
+          <w:rFonts w:ascii="Times New Roman" w:hAnsi="Times New Roman" w:cs="Times New Roman"/>
+        </w:rPr>
+        <w:t>Chương trình</w:t>
+      </w:r>
+      <w:r>
+        <w:rPr>
+          <w:rFonts w:ascii="Times New Roman" w:hAnsi="Times New Roman" w:cs="Times New Roman"/>
+        </w:rPr>
+        <w:t xml:space="preserve"> chính</w:t>
+      </w:r>
+      <w:r>
+        <w:rPr>
+          <w:rFonts w:ascii="Times New Roman" w:hAnsi="Times New Roman" w:cs="Times New Roman"/>
+        </w:rPr>
+        <w:t xml:space="preserve"> kích hoạt hệ thống ( main.cpp )</w:t>
+      </w:r>
+    </w:p>
+    <w:p>
+      <w:pPr>
+        <w:pStyle w:val="ListParagraph"/>
+        <w:numPr>
+          <w:ilvl w:val="0"/>
+          <w:numId w:val="7"/>
+        </w:numPr>
+      </w:pPr>
+      <w:r>
+        <w:rPr>
+          <w:b/>
+        </w:rPr>
+        <w:t>map&lt;string,int&gt; SanPham::DemMatHang;:</w:t>
+      </w:r>
+      <w:r>
+        <w:t xml:space="preserve"> Định nghĩa biến tĩnh toàn cục cho lớp </w:t>
+      </w:r>
+      <w:r>
+        <w:rPr>
+          <w:b/>
+          <w:bCs w:val="0"/>
+        </w:rPr>
+        <w:t>SanPham</w:t>
+      </w:r>
+      <w:r>
+        <w:t xml:space="preserve"> để cấp phát bộ nhớ cho biến đếm STT sản phẩm.</w:t>
+      </w:r>
+    </w:p>
+    <w:p>
+      <w:pPr>
+        <w:pStyle w:val="ListParagraph"/>
+        <w:numPr>
+          <w:ilvl w:val="0"/>
+          <w:numId w:val="7"/>
+        </w:numPr>
+      </w:pPr>
+      <w:r>
+        <w:rPr>
+          <w:b/>
+        </w:rPr>
+        <w:t>main():</w:t>
+      </w:r>
+      <w:r>
+        <w:t xml:space="preserve"> Chứa một vòng lặp vô hạn </w:t>
+      </w:r>
+      <w:r>
+        <w:rPr>
+          <w:b/>
+          <w:bCs w:val="0"/>
+        </w:rPr>
+        <w:t>while (true)</w:t>
+      </w:r>
+      <w:r>
+        <w:t xml:space="preserve">. Trong mỗi chu kỳ, chương trình sẽ dựng giao diện qua </w:t>
+      </w:r>
+      <w:r>
+        <w:rPr>
+          <w:b/>
+          <w:bCs w:val="0"/>
+        </w:rPr>
+        <w:t>hienThiMenu()</w:t>
+      </w:r>
+      <w:r>
+        <w:t xml:space="preserve">, bắt lỗi nhập liệu từ người dùng (nếu nhập chữ thay vì nhập số sẽ tự động xóa bộ đệm lỗi bằng </w:t>
+      </w:r>
+      <w:r>
+        <w:rPr>
+          <w:b/>
+          <w:bCs w:val="0"/>
+        </w:rPr>
+        <w:t>cin.clear()</w:t>
+      </w:r>
+      <w:r>
+        <w:t xml:space="preserve"> và </w:t>
+      </w:r>
+      <w:r>
+        <w:rPr>
+          <w:b/>
+          <w:bCs w:val="0"/>
+        </w:rPr>
+        <w:t>cin.ignore()</w:t>
+      </w:r>
+      <w:r>
+        <w:t xml:space="preserve">). Khi người dùng chọn 9, lệnh </w:t>
+      </w:r>
+      <w:r>
+        <w:rPr>
+          <w:b/>
+          <w:bCs w:val="0"/>
+        </w:rPr>
+        <w:t>break</w:t>
+      </w:r>
+      <w:r>
+        <w:t xml:space="preserve"> được kích hoạt để kết thúc và đóng chương trình một cách an toàn.</w:t>
+      </w:r>
+    </w:p>
+    <w:p>
+      <w:r>
+        <w:br w:type="page"/>
+      </w:r>
+    </w:p>
+    <w:p>
+      <w:pPr>
+        <w:pStyle w:val="Heading2"/>
+        <w:numPr>
+          <w:ilvl w:val="1"/>
+          <w:numId w:val="1"/>
+        </w:numPr>
+        <w:rPr>
+          <w:rFonts w:ascii="Times New Roman" w:hAnsi="Times New Roman" w:cs="Times New Roman"/>
+          <w:sz w:val="26"/>
+          <w:szCs w:val="26"/>
+        </w:rPr>
+      </w:pPr>
+      <w:r>
+        <w:rPr>
+          <w:noProof/>
+        </w:rPr>
+        <w:lastRenderedPageBreak/>
+        <w:drawing>
+          <wp:anchor distT="0" distB="0" distL="114300" distR="114300" simplePos="0" relativeHeight="251658240" behindDoc="0" locked="0" layoutInCell="1" allowOverlap="1" wp14:anchorId="454B9545" wp14:editId="40F51E5F">
+            <wp:simplePos x="0" y="0"/>
+            <wp:positionH relativeFrom="column">
+              <wp:posOffset>1487805</wp:posOffset>
+            </wp:positionH>
+            <wp:positionV relativeFrom="paragraph">
+              <wp:posOffset>0</wp:posOffset>
+            </wp:positionV>
+            <wp:extent cx="4762500" cy="9220200"/>
+            <wp:effectExtent l="0" t="0" r="0" b="0"/>
+            <wp:wrapSquare wrapText="bothSides"/>
+            <wp:docPr id="8" name="Picture 8"/>
+            <wp:cNvGraphicFramePr>
+              <a:graphicFrameLocks xmlns:a="http://schemas.openxmlformats.org/drawingml/2006/main" noChangeAspect="1"/>
+            </wp:cNvGraphicFramePr>
+            <a:graphic xmlns:a="http://schemas.openxmlformats.org/drawingml/2006/main">
+              <a:graphicData uri="http://schemas.openxmlformats.org/drawingml/2006/picture">
+                <pic:pic xmlns:pic="http://schemas.openxmlformats.org/drawingml/2006/picture">
+                  <pic:nvPicPr>
+                    <pic:cNvPr id="0" name="Picture 22"/>
+                    <pic:cNvPicPr>
+                      <a:picLocks noChangeAspect="1" noChangeArrowheads="1"/>
+                    </pic:cNvPicPr>
+                  </pic:nvPicPr>
+                  <pic:blipFill>
+                    <a:blip r:embed="rId12" cstate="print">
+                      <a:extLst>
+                        <a:ext uri="{28A0092B-C50C-407E-A947-70E740481C1C}">
+                          <a14:useLocalDpi xmlns:a14="http://schemas.microsoft.com/office/drawing/2010/main" val="0"/>
+                        </a:ext>
+                      </a:extLst>
+                    </a:blip>
+                    <a:srcRect/>
+                    <a:stretch>
+                      <a:fillRect/>
+                    </a:stretch>
+                  </pic:blipFill>
+                  <pic:spPr bwMode="auto">
+                    <a:xfrm>
+                      <a:off x="0" y="0"/>
+                      <a:ext cx="4762500" cy="9220200"/>
+                    </a:xfrm>
+                    <a:prstGeom prst="rect">
+                      <a:avLst/>
+                    </a:prstGeom>
+                    <a:noFill/>
+                    <a:ln>
+                      <a:noFill/>
+                    </a:ln>
+                  </pic:spPr>
+                </pic:pic>
+              </a:graphicData>
+            </a:graphic>
+            <wp14:sizeRelH relativeFrom="page">
+              <wp14:pctWidth>0</wp14:pctWidth>
+            </wp14:sizeRelH>
+            <wp14:sizeRelV relativeFrom="page">
+              <wp14:pctHeight>0</wp14:pctHeight>
+            </wp14:sizeRelV>
+          </wp:anchor>
+        </w:drawing>
+      </w:r>
+      <w:r>
+        <w:rPr>
+          <w:rFonts w:ascii="Times New Roman" w:hAnsi="Times New Roman" w:cs="Times New Roman"/>
+          <w:sz w:val="26"/>
+          <w:szCs w:val="26"/>
+        </w:rPr>
+        <w:t xml:space="preserve">Biểu đồ </w:t>
+      </w:r>
+      <w:r>
+        <w:rPr>
+          <w:rFonts w:ascii="Times New Roman" w:hAnsi="Times New Roman" w:cs="Times New Roman"/>
+          <w:sz w:val="26"/>
+          <w:szCs w:val="26"/>
+        </w:rPr>
+        <w:t>UML</w:t>
+      </w:r>
+      <w:r>
+        <w:rPr>
+          <w:rFonts w:ascii="Times New Roman" w:hAnsi="Times New Roman" w:cs="Times New Roman"/>
+          <w:sz w:val="26"/>
+          <w:szCs w:val="26"/>
+        </w:rPr>
+        <w:t xml:space="preserve"> </w:t>
+      </w:r>
+      <w:r>
+        <w:rPr>
+          <w:rFonts w:ascii="Times New Roman" w:hAnsi="Times New Roman" w:cs="Times New Roman"/>
+          <w:sz w:val="26"/>
+          <w:szCs w:val="26"/>
+        </w:rPr>
+        <w:t xml:space="preserve">Use Case </w:t>
+      </w:r>
+    </w:p>
+    <w:p>
+      <w:pPr>
         <w:ind w:firstLine="0"/>
         <w:jc w:val="left"/>
       </w:pPr>
       <w:r>
-        <w:br w:type="page"/>
-      </w:r>
-    </w:p>
+        <w:t>Mô tả toàn bộ các chức năng nghiệp vụ mà người vận hành hệ thống (Nhân viên / Quản lý) có thể thực hiện thông qua giao diện Menu điều khiển.</w:t>
+      </w:r>
+    </w:p>
+    <w:p/>
     <w:p>
       <w:pPr>
         <w:pStyle w:val="Heading1"/>
@@ -25778,7 +26970,6 @@
           <w:rFonts w:ascii="Times New Roman" w:hAnsi="Times New Roman" w:cs="Times New Roman"/>
         </w:rPr>
       </w:pPr>
-      <w:bookmarkStart w:id="48" w:name="_Toc231659701"/>
       <w:r>
         <w:rPr>
           <w:rFonts w:ascii="Times New Roman" w:hAnsi="Times New Roman" w:cs="Times New Roman"/>
@@ -25786,7 +26977,7 @@
         <w:lastRenderedPageBreak/>
         <w:t>Tên Nội dung 4</w:t>
       </w:r>
-      <w:bookmarkEnd w:id="48"/>
+      <w:bookmarkEnd w:id="45"/>
     </w:p>
     <w:p>
       <w:pPr>
@@ -25800,14 +26991,14 @@
           <w:rFonts w:ascii="Times New Roman" w:hAnsi="Times New Roman" w:cs="Times New Roman"/>
         </w:rPr>
       </w:pPr>
-      <w:bookmarkStart w:id="49" w:name="_Toc231659702"/>
+      <w:bookmarkStart w:id="46" w:name="_Toc231659702"/>
       <w:r>
         <w:rPr>
           <w:rFonts w:ascii="Times New Roman" w:hAnsi="Times New Roman" w:cs="Times New Roman"/>
         </w:rPr>
         <w:t>Nội dung</w:t>
       </w:r>
-      <w:bookmarkEnd w:id="49"/>
+      <w:bookmarkEnd w:id="46"/>
       <w:r>
         <w:rPr>
           <w:rFonts w:ascii="Times New Roman" w:hAnsi="Times New Roman" w:cs="Times New Roman"/>
@@ -25827,14 +27018,14 @@
           <w:rFonts w:ascii="Times New Roman" w:hAnsi="Times New Roman" w:cs="Times New Roman"/>
         </w:rPr>
       </w:pPr>
-      <w:bookmarkStart w:id="50" w:name="_Toc231659703"/>
+      <w:bookmarkStart w:id="47" w:name="_Toc231659703"/>
       <w:r>
         <w:rPr>
           <w:rFonts w:ascii="Times New Roman" w:hAnsi="Times New Roman" w:cs="Times New Roman"/>
         </w:rPr>
         <w:t>Nội dung nhỏ</w:t>
       </w:r>
-      <w:bookmarkEnd w:id="50"/>
+      <w:bookmarkEnd w:id="47"/>
     </w:p>
     <w:p>
       <w:pPr>
@@ -25848,14 +27039,14 @@
           <w:rFonts w:ascii="Times New Roman" w:hAnsi="Times New Roman" w:cs="Times New Roman"/>
         </w:rPr>
       </w:pPr>
-      <w:bookmarkStart w:id="51" w:name="_Toc231659704"/>
+      <w:bookmarkStart w:id="48" w:name="_Toc231659704"/>
       <w:r>
         <w:rPr>
           <w:rFonts w:ascii="Times New Roman" w:hAnsi="Times New Roman" w:cs="Times New Roman"/>
         </w:rPr>
         <w:t>Nội dung nhỏ</w:t>
       </w:r>
-      <w:bookmarkEnd w:id="51"/>
+      <w:bookmarkEnd w:id="48"/>
     </w:p>
     <w:p>
       <w:pPr>
@@ -25869,14 +27060,14 @@
           <w:rFonts w:ascii="Times New Roman" w:hAnsi="Times New Roman" w:cs="Times New Roman"/>
         </w:rPr>
       </w:pPr>
-      <w:bookmarkStart w:id="52" w:name="_Toc231659705"/>
+      <w:bookmarkStart w:id="49" w:name="_Toc231659705"/>
       <w:r>
         <w:rPr>
           <w:rFonts w:ascii="Times New Roman" w:hAnsi="Times New Roman" w:cs="Times New Roman"/>
         </w:rPr>
         <w:t>Nội dung</w:t>
       </w:r>
-      <w:bookmarkEnd w:id="52"/>
+      <w:bookmarkEnd w:id="49"/>
     </w:p>
     <w:p>
       <w:pPr>
@@ -25890,14 +27081,14 @@
           <w:rFonts w:ascii="Times New Roman" w:hAnsi="Times New Roman" w:cs="Times New Roman"/>
         </w:rPr>
       </w:pPr>
-      <w:bookmarkStart w:id="53" w:name="_Toc231659706"/>
+      <w:bookmarkStart w:id="50" w:name="_Toc231659706"/>
       <w:r>
         <w:rPr>
           <w:rFonts w:ascii="Times New Roman" w:hAnsi="Times New Roman" w:cs="Times New Roman"/>
         </w:rPr>
         <w:t>Nội dung nhỏ</w:t>
       </w:r>
-      <w:bookmarkEnd w:id="53"/>
+      <w:bookmarkEnd w:id="50"/>
     </w:p>
     <w:p>
       <w:pPr>
@@ -25911,14 +27102,14 @@
           <w:rFonts w:ascii="Times New Roman" w:hAnsi="Times New Roman" w:cs="Times New Roman"/>
         </w:rPr>
       </w:pPr>
-      <w:bookmarkStart w:id="54" w:name="_Toc231659707"/>
+      <w:bookmarkStart w:id="51" w:name="_Toc231659707"/>
       <w:r>
         <w:rPr>
           <w:rFonts w:ascii="Times New Roman" w:hAnsi="Times New Roman" w:cs="Times New Roman"/>
         </w:rPr>
         <w:t>Nội dung nhỏ</w:t>
       </w:r>
-      <w:bookmarkEnd w:id="54"/>
+      <w:bookmarkEnd w:id="51"/>
     </w:p>
     <w:p>
       <w:pPr>
@@ -25932,14 +27123,14 @@
           <w:rFonts w:ascii="Times New Roman" w:hAnsi="Times New Roman" w:cs="Times New Roman"/>
         </w:rPr>
       </w:pPr>
-      <w:bookmarkStart w:id="55" w:name="_Toc231659708"/>
+      <w:bookmarkStart w:id="52" w:name="_Toc231659708"/>
       <w:r>
         <w:rPr>
           <w:rFonts w:ascii="Times New Roman" w:hAnsi="Times New Roman" w:cs="Times New Roman"/>
         </w:rPr>
         <w:t>Nội dung</w:t>
       </w:r>
-      <w:bookmarkEnd w:id="55"/>
+      <w:bookmarkEnd w:id="52"/>
       <w:r>
         <w:rPr>
           <w:rFonts w:ascii="Times New Roman" w:hAnsi="Times New Roman" w:cs="Times New Roman"/>
@@ -25959,14 +27150,14 @@
           <w:rFonts w:ascii="Times New Roman" w:hAnsi="Times New Roman" w:cs="Times New Roman"/>
         </w:rPr>
       </w:pPr>
-      <w:bookmarkStart w:id="56" w:name="_Toc231659709"/>
+      <w:bookmarkStart w:id="53" w:name="_Toc231659709"/>
       <w:r>
         <w:rPr>
           <w:rFonts w:ascii="Times New Roman" w:hAnsi="Times New Roman" w:cs="Times New Roman"/>
         </w:rPr>
         <w:t>Nội dung nhỏ</w:t>
       </w:r>
-      <w:bookmarkEnd w:id="56"/>
+      <w:bookmarkEnd w:id="53"/>
     </w:p>
     <w:p>
       <w:pPr>
@@ -25980,14 +27171,14 @@
           <w:rFonts w:ascii="Times New Roman" w:hAnsi="Times New Roman" w:cs="Times New Roman"/>
         </w:rPr>
       </w:pPr>
-      <w:bookmarkStart w:id="57" w:name="_Toc231659710"/>
+      <w:bookmarkStart w:id="54" w:name="_Toc231659710"/>
       <w:r>
         <w:rPr>
           <w:rFonts w:ascii="Times New Roman" w:hAnsi="Times New Roman" w:cs="Times New Roman"/>
         </w:rPr>
         <w:t>Nội dung nhỏ</w:t>
       </w:r>
-      <w:bookmarkEnd w:id="57"/>
+      <w:bookmarkEnd w:id="54"/>
     </w:p>
     <w:p>
       <w:pPr>
@@ -26011,7 +27202,7 @@
           <w:rFonts w:ascii="Times New Roman" w:hAnsi="Times New Roman" w:cs="Times New Roman"/>
         </w:rPr>
       </w:pPr>
-      <w:bookmarkStart w:id="58" w:name="_Toc231659711"/>
+      <w:bookmarkStart w:id="55" w:name="_Toc231659711"/>
       <w:r>
         <w:rPr>
           <w:rFonts w:ascii="Times New Roman" w:hAnsi="Times New Roman" w:cs="Times New Roman"/>
@@ -26019,7 +27210,7 @@
         <w:lastRenderedPageBreak/>
         <w:t>Tên Nội dung 5</w:t>
       </w:r>
-      <w:bookmarkEnd w:id="58"/>
+      <w:bookmarkEnd w:id="55"/>
     </w:p>
     <w:p>
       <w:pPr>
@@ -26033,14 +27224,14 @@
           <w:rFonts w:ascii="Times New Roman" w:hAnsi="Times New Roman" w:cs="Times New Roman"/>
         </w:rPr>
       </w:pPr>
-      <w:bookmarkStart w:id="59" w:name="_Toc231659712"/>
+      <w:bookmarkStart w:id="56" w:name="_Toc231659712"/>
       <w:r>
         <w:rPr>
           <w:rFonts w:ascii="Times New Roman" w:hAnsi="Times New Roman" w:cs="Times New Roman"/>
         </w:rPr>
         <w:t>Nội dung</w:t>
       </w:r>
-      <w:bookmarkEnd w:id="59"/>
+      <w:bookmarkEnd w:id="56"/>
       <w:r>
         <w:rPr>
           <w:rFonts w:ascii="Times New Roman" w:hAnsi="Times New Roman" w:cs="Times New Roman"/>
@@ -26060,14 +27251,14 @@
           <w:rFonts w:ascii="Times New Roman" w:hAnsi="Times New Roman" w:cs="Times New Roman"/>
         </w:rPr>
       </w:pPr>
-      <w:bookmarkStart w:id="60" w:name="_Toc231659713"/>
+      <w:bookmarkStart w:id="57" w:name="_Toc231659713"/>
       <w:r>
         <w:rPr>
           <w:rFonts w:ascii="Times New Roman" w:hAnsi="Times New Roman" w:cs="Times New Roman"/>
         </w:rPr>
         <w:t>Nội dung nhỏ</w:t>
       </w:r>
-      <w:bookmarkEnd w:id="60"/>
+      <w:bookmarkEnd w:id="57"/>
     </w:p>
     <w:p>
       <w:pPr>
@@ -26081,14 +27272,14 @@
           <w:rFonts w:ascii="Times New Roman" w:hAnsi="Times New Roman" w:cs="Times New Roman"/>
         </w:rPr>
       </w:pPr>
-      <w:bookmarkStart w:id="61" w:name="_Toc231659714"/>
+      <w:bookmarkStart w:id="58" w:name="_Toc231659714"/>
       <w:r>
         <w:rPr>
           <w:rFonts w:ascii="Times New Roman" w:hAnsi="Times New Roman" w:cs="Times New Roman"/>
         </w:rPr>
         <w:t>Nội dung nhỏ</w:t>
       </w:r>
-      <w:bookmarkEnd w:id="61"/>
+      <w:bookmarkEnd w:id="58"/>
     </w:p>
     <w:p>
       <w:pPr>
@@ -26102,14 +27293,14 @@
           <w:rFonts w:ascii="Times New Roman" w:hAnsi="Times New Roman" w:cs="Times New Roman"/>
         </w:rPr>
       </w:pPr>
-      <w:bookmarkStart w:id="62" w:name="_Toc231659715"/>
+      <w:bookmarkStart w:id="59" w:name="_Toc231659715"/>
       <w:r>
         <w:rPr>
           <w:rFonts w:ascii="Times New Roman" w:hAnsi="Times New Roman" w:cs="Times New Roman"/>
         </w:rPr>
         <w:t>Nội dung</w:t>
       </w:r>
-      <w:bookmarkEnd w:id="62"/>
+      <w:bookmarkEnd w:id="59"/>
     </w:p>
     <w:p>
       <w:pPr>
@@ -26123,14 +27314,14 @@
           <w:rFonts w:ascii="Times New Roman" w:hAnsi="Times New Roman" w:cs="Times New Roman"/>
         </w:rPr>
       </w:pPr>
-      <w:bookmarkStart w:id="63" w:name="_Toc231659716"/>
+      <w:bookmarkStart w:id="60" w:name="_Toc231659716"/>
       <w:r>
         <w:rPr>
           <w:rFonts w:ascii="Times New Roman" w:hAnsi="Times New Roman" w:cs="Times New Roman"/>
         </w:rPr>
         <w:t>Nội dung nhỏ</w:t>
       </w:r>
-      <w:bookmarkEnd w:id="63"/>
+      <w:bookmarkEnd w:id="60"/>
     </w:p>
     <w:p>
       <w:pPr>
@@ -26144,14 +27335,14 @@
           <w:rFonts w:ascii="Times New Roman" w:hAnsi="Times New Roman" w:cs="Times New Roman"/>
         </w:rPr>
       </w:pPr>
-      <w:bookmarkStart w:id="64" w:name="_Toc231659717"/>
+      <w:bookmarkStart w:id="61" w:name="_Toc231659717"/>
       <w:r>
         <w:rPr>
           <w:rFonts w:ascii="Times New Roman" w:hAnsi="Times New Roman" w:cs="Times New Roman"/>
         </w:rPr>
         <w:t>Nội dung nhỏ</w:t>
       </w:r>
-      <w:bookmarkEnd w:id="64"/>
+      <w:bookmarkEnd w:id="61"/>
     </w:p>
     <w:p>
       <w:pPr>
@@ -26165,14 +27356,14 @@
           <w:rFonts w:ascii="Times New Roman" w:hAnsi="Times New Roman" w:cs="Times New Roman"/>
         </w:rPr>
       </w:pPr>
-      <w:bookmarkStart w:id="65" w:name="_Toc231659718"/>
+      <w:bookmarkStart w:id="62" w:name="_Toc231659718"/>
       <w:r>
         <w:rPr>
           <w:rFonts w:ascii="Times New Roman" w:hAnsi="Times New Roman" w:cs="Times New Roman"/>
         </w:rPr>
         <w:t>Nội dung</w:t>
       </w:r>
-      <w:bookmarkEnd w:id="65"/>
+      <w:bookmarkEnd w:id="62"/>
       <w:r>
         <w:rPr>
           <w:rFonts w:ascii="Times New Roman" w:hAnsi="Times New Roman" w:cs="Times New Roman"/>
@@ -26192,14 +27383,14 @@
           <w:rFonts w:ascii="Times New Roman" w:hAnsi="Times New Roman" w:cs="Times New Roman"/>
         </w:rPr>
       </w:pPr>
-      <w:bookmarkStart w:id="66" w:name="_Toc231659719"/>
+      <w:bookmarkStart w:id="63" w:name="_Toc231659719"/>
       <w:r>
         <w:rPr>
           <w:rFonts w:ascii="Times New Roman" w:hAnsi="Times New Roman" w:cs="Times New Roman"/>
         </w:rPr>
         <w:t>Nội dung nhỏ</w:t>
       </w:r>
-      <w:bookmarkEnd w:id="66"/>
+      <w:bookmarkEnd w:id="63"/>
     </w:p>
     <w:p>
       <w:pPr>
@@ -26213,14 +27404,14 @@
           <w:rFonts w:ascii="Times New Roman" w:hAnsi="Times New Roman" w:cs="Times New Roman"/>
         </w:rPr>
       </w:pPr>
-      <w:bookmarkStart w:id="67" w:name="_Toc231659720"/>
+      <w:bookmarkStart w:id="64" w:name="_Toc231659720"/>
       <w:r>
         <w:rPr>
           <w:rFonts w:ascii="Times New Roman" w:hAnsi="Times New Roman" w:cs="Times New Roman"/>
         </w:rPr>
         <w:t>Nội dung nhỏ</w:t>
       </w:r>
-      <w:bookmarkEnd w:id="67"/>
+      <w:bookmarkEnd w:id="64"/>
     </w:p>
     <w:p>
       <w:pPr>
@@ -26298,7 +27489,7 @@
         </w:rPr>
         <w:br w:type="page"/>
       </w:r>
-      <w:bookmarkStart w:id="68" w:name="_Toc231659721"/>
+      <w:bookmarkStart w:id="65" w:name="_Toc231659721"/>
       <w:r>
         <w:rPr>
           <w:rFonts w:ascii="Times New Roman" w:hAnsi="Times New Roman" w:cs="Times New Roman"/>
@@ -26306,7 +27497,7 @@
         <w:lastRenderedPageBreak/>
         <w:t>KẾT LUẬN VÀ HƯỚNG PHÁT TRIỂN</w:t>
       </w:r>
-      <w:bookmarkEnd w:id="68"/>
+      <w:bookmarkEnd w:id="65"/>
     </w:p>
     <w:p>
       <w:pPr>
@@ -26475,7 +27666,7 @@
         </w:rPr>
         <w:br w:type="page"/>
       </w:r>
-      <w:bookmarkStart w:id="69" w:name="_Toc231659722"/>
+      <w:bookmarkStart w:id="66" w:name="_Toc231659722"/>
       <w:r>
         <w:rPr>
           <w:rFonts w:ascii="Times New Roman" w:hAnsi="Times New Roman" w:cs="Times New Roman"/>
@@ -26483,7 +27674,7 @@
         <w:lastRenderedPageBreak/>
         <w:t>DANH MỤC TÀI LIỆU THAM KHẢO</w:t>
       </w:r>
-      <w:bookmarkEnd w:id="69"/>
+      <w:bookmarkEnd w:id="66"/>
     </w:p>
     <w:p>
       <w:pPr>
@@ -26784,7 +27975,7 @@
           <w:bCs/>
         </w:rPr>
       </w:pPr>
-      <w:bookmarkStart w:id="70" w:name="_Toc231659723"/>
+      <w:bookmarkStart w:id="67" w:name="_Toc231659723"/>
       <w:r>
         <w:rPr>
           <w:rFonts w:ascii="Times New Roman" w:hAnsi="Times New Roman" w:cs="Times New Roman"/>
@@ -26793,7 +27984,7 @@
         <w:lastRenderedPageBreak/>
         <w:t>PHÂN CÔNG CÔNG VIỆC NHÓM</w:t>
       </w:r>
-      <w:bookmarkEnd w:id="70"/>
+      <w:bookmarkEnd w:id="67"/>
     </w:p>
     <w:tbl>
       <w:tblPr>
@@ -26919,6 +28110,9 @@
               <w:spacing w:line="480" w:lineRule="atLeast"/>
               <w:ind w:firstLine="0"/>
             </w:pPr>
+            <w:r>
+              <w:t>35</w:t>
+            </w:r>
           </w:p>
         </w:tc>
       </w:tr>
@@ -26946,6 +28140,9 @@
               <w:spacing w:line="480" w:lineRule="atLeast"/>
               <w:ind w:firstLine="0"/>
             </w:pPr>
+            <w:r>
+              <w:t>Nguyễn Hồng Nam</w:t>
+            </w:r>
           </w:p>
         </w:tc>
         <w:tc>
@@ -26957,6 +28154,12 @@
               <w:spacing w:line="480" w:lineRule="atLeast"/>
               <w:ind w:firstLine="0"/>
             </w:pPr>
+            <w:r>
+              <w:t>5</w:t>
+            </w:r>
+            <w:r>
+              <w:t>5</w:t>
+            </w:r>
           </w:p>
         </w:tc>
       </w:tr>
@@ -26984,6 +28187,9 @@
               <w:spacing w:line="480" w:lineRule="atLeast"/>
               <w:ind w:firstLine="0"/>
             </w:pPr>
+            <w:r>
+              <w:t>Nguyễn Văn Huy</w:t>
+            </w:r>
           </w:p>
         </w:tc>
         <w:tc>
@@ -26995,6 +28201,9 @@
               <w:spacing w:line="480" w:lineRule="atLeast"/>
               <w:ind w:firstLine="0"/>
             </w:pPr>
+            <w:r>
+              <w:t>10</w:t>
+            </w:r>
           </w:p>
         </w:tc>
       </w:tr>
@@ -27011,8 +28220,8 @@
           <w:rFonts w:ascii="Times New Roman" w:hAnsi="Times New Roman" w:cs="Times New Roman"/>
         </w:rPr>
       </w:pPr>
-      <w:bookmarkStart w:id="71" w:name="_heading=h.1rvwp1q" w:colFirst="0" w:colLast="0"/>
-      <w:bookmarkEnd w:id="71"/>
+      <w:bookmarkStart w:id="68" w:name="_heading=h.1rvwp1q" w:colFirst="0" w:colLast="0"/>
+      <w:bookmarkEnd w:id="68"/>
     </w:p>
     <w:sectPr>
       <w:pgSz w:w="11907" w:h="16839"/>
@@ -27227,7 +28436,7 @@
   <w:abstractNum w:abstractNumId="1" w15:restartNumberingAfterBreak="0">
     <w:nsid w:val="06411A0E"/>
     <w:multiLevelType w:val="multilevel"/>
-    <w:tmpl w:val="B036963C"/>
+    <w:tmpl w:val="73C0FE68"/>
     <w:lvl w:ilvl="0">
       <w:start w:val="1"/>
       <w:numFmt w:val="decimal"/>
@@ -27249,6 +28458,11 @@
       <w:pPr>
         <w:ind w:left="576" w:hanging="576"/>
       </w:pPr>
+      <w:rPr>
+        <w:rFonts w:ascii="Times New Roman" w:hAnsi="Times New Roman" w:cs="Times New Roman" w:hint="default"/>
+        <w:sz w:val="26"/>
+        <w:szCs w:val="26"/>
+      </w:rPr>
     </w:lvl>
     <w:lvl w:ilvl="2">
       <w:start w:val="1"/>
@@ -27735,7 +28949,7 @@
   <w:abstractNum w:abstractNumId="5" w15:restartNumberingAfterBreak="0">
     <w:nsid w:val="74361A14"/>
     <w:multiLevelType w:val="multilevel"/>
-    <w:tmpl w:val="DFB25704"/>
+    <w:tmpl w:val="297260F0"/>
     <w:lvl w:ilvl="0">
       <w:start w:val="1"/>
       <w:numFmt w:val="decimal"/>
@@ -27761,6 +28975,9 @@
         </w:tabs>
         <w:ind w:left="1440" w:hanging="720"/>
       </w:pPr>
+      <w:rPr>
+        <w:rFonts w:ascii="Times New Roman" w:hAnsi="Times New Roman" w:cs="Times New Roman" w:hint="default"/>
+      </w:rPr>
     </w:lvl>
     <w:lvl w:ilvl="2">
       <w:start w:val="1"/>

</xml_diff>